<commit_message>
feat: accounts/save/resume system with Clerk, Drizzle, autosave, cron reminders, Stripe webhook, entitlement check
Co-Authored-By: Claude Sonnet 4.6 <noreply@anthropic.com>
</commit_message>
<xml_diff>
--- a/Site.docx
+++ b/Site.docx
@@ -192,7 +192,6 @@
                 <w14:ligatures w14:val="none"/>
               </w:rPr>
             </w:pPr>
-            <w:proofErr w:type="spellStart"/>
             <w:r>
               <w:rPr>
                 <w:rFonts w:ascii="Times New Roman" w:eastAsia="Times New Roman" w:hAnsi="Times New Roman" w:cs="Times New Roman"/>
@@ -204,7 +203,6 @@
               </w:rPr>
               <w:t>Appti</w:t>
             </w:r>
-            <w:proofErr w:type="spellEnd"/>
           </w:p>
         </w:tc>
         <w:tc>
@@ -519,31 +517,7 @@
                 <w:lang w:eastAsia="en-AU"/>
                 <w14:ligatures w14:val="none"/>
               </w:rPr>
-              <w:t xml:space="preserve"> Full SEO implementation service and location targeting with funnels, sanity blog, </w:t>
-            </w:r>
-            <w:proofErr w:type="spellStart"/>
-            <w:r>
-              <w:rPr>
-                <w:rFonts w:ascii="Times New Roman" w:eastAsia="Times New Roman" w:hAnsi="Times New Roman" w:cs="Times New Roman"/>
-                <w:kern w:val="0"/>
-                <w:sz w:val="24"/>
-                <w:szCs w:val="24"/>
-                <w:lang w:eastAsia="en-AU"/>
-                <w14:ligatures w14:val="none"/>
-              </w:rPr>
-              <w:t>Formspree</w:t>
-            </w:r>
-            <w:proofErr w:type="spellEnd"/>
-            <w:r>
-              <w:rPr>
-                <w:rFonts w:ascii="Times New Roman" w:eastAsia="Times New Roman" w:hAnsi="Times New Roman" w:cs="Times New Roman"/>
-                <w:kern w:val="0"/>
-                <w:sz w:val="24"/>
-                <w:szCs w:val="24"/>
-                <w:lang w:eastAsia="en-AU"/>
-                <w14:ligatures w14:val="none"/>
-              </w:rPr>
-              <w:t xml:space="preserve"> contact form.</w:t>
+              <w:t xml:space="preserve"> Full SEO implementation service and location targeting with funnels, sanity blog, Formspree contact form.</w:t>
             </w:r>
             <w:r>
               <w:rPr>
@@ -565,106 +539,29 @@
                 <w:lang w:eastAsia="en-AU"/>
                 <w14:ligatures w14:val="none"/>
               </w:rPr>
-              <w:t>Sanity blog</w:t>
-            </w:r>
-            <w:r>
-              <w:rPr>
-                <w:rFonts w:ascii="Times New Roman" w:eastAsia="Times New Roman" w:hAnsi="Times New Roman" w:cs="Times New Roman"/>
-                <w:kern w:val="0"/>
-                <w:sz w:val="24"/>
-                <w:szCs w:val="24"/>
-                <w:lang w:eastAsia="en-AU"/>
-                <w14:ligatures w14:val="none"/>
-              </w:rPr>
-              <w:t>.</w:t>
-            </w:r>
-            <w:r>
-              <w:rPr>
-                <w:rFonts w:ascii="Times New Roman" w:eastAsia="Times New Roman" w:hAnsi="Times New Roman" w:cs="Times New Roman"/>
-                <w:kern w:val="0"/>
-                <w:sz w:val="24"/>
-                <w:szCs w:val="24"/>
-                <w:lang w:eastAsia="en-AU"/>
-                <w14:ligatures w14:val="none"/>
-              </w:rPr>
-              <w:t xml:space="preserve"> </w:t>
-            </w:r>
-            <w:r>
-              <w:rPr>
-                <w:rFonts w:ascii="Times New Roman" w:eastAsia="Times New Roman" w:hAnsi="Times New Roman" w:cs="Times New Roman"/>
-                <w:kern w:val="0"/>
-                <w:sz w:val="24"/>
-                <w:szCs w:val="24"/>
-                <w:lang w:eastAsia="en-AU"/>
-                <w14:ligatures w14:val="none"/>
-              </w:rPr>
-              <w:t xml:space="preserve">Google </w:t>
-            </w:r>
-            <w:r>
-              <w:rPr>
-                <w:rFonts w:ascii="Times New Roman" w:eastAsia="Times New Roman" w:hAnsi="Times New Roman" w:cs="Times New Roman"/>
-                <w:kern w:val="0"/>
-                <w:sz w:val="24"/>
-                <w:szCs w:val="24"/>
-                <w:lang w:eastAsia="en-AU"/>
-                <w14:ligatures w14:val="none"/>
-              </w:rPr>
-              <w:t>B</w:t>
-            </w:r>
-            <w:r>
-              <w:rPr>
-                <w:rFonts w:ascii="Times New Roman" w:eastAsia="Times New Roman" w:hAnsi="Times New Roman" w:cs="Times New Roman"/>
-                <w:kern w:val="0"/>
-                <w:sz w:val="24"/>
-                <w:szCs w:val="24"/>
-                <w:lang w:eastAsia="en-AU"/>
-                <w14:ligatures w14:val="none"/>
-              </w:rPr>
-              <w:t xml:space="preserve">usiness </w:t>
-            </w:r>
-            <w:r>
-              <w:rPr>
-                <w:rFonts w:ascii="Times New Roman" w:eastAsia="Times New Roman" w:hAnsi="Times New Roman" w:cs="Times New Roman"/>
-                <w:kern w:val="0"/>
-                <w:sz w:val="24"/>
-                <w:szCs w:val="24"/>
-                <w:lang w:eastAsia="en-AU"/>
-                <w14:ligatures w14:val="none"/>
-              </w:rPr>
-              <w:t>P</w:t>
-            </w:r>
-            <w:r>
-              <w:rPr>
-                <w:rFonts w:ascii="Times New Roman" w:eastAsia="Times New Roman" w:hAnsi="Times New Roman" w:cs="Times New Roman"/>
-                <w:kern w:val="0"/>
-                <w:sz w:val="24"/>
-                <w:szCs w:val="24"/>
-                <w:lang w:eastAsia="en-AU"/>
-                <w14:ligatures w14:val="none"/>
-              </w:rPr>
-              <w:t>rofile management.</w:t>
-            </w:r>
-            <w:r>
-              <w:rPr>
-                <w:rFonts w:ascii="Times New Roman" w:eastAsia="Times New Roman" w:hAnsi="Times New Roman" w:cs="Times New Roman"/>
-                <w:kern w:val="0"/>
-                <w:sz w:val="24"/>
-                <w:szCs w:val="24"/>
-                <w:lang w:eastAsia="en-AU"/>
-                <w14:ligatures w14:val="none"/>
-              </w:rPr>
-              <w:t xml:space="preserve"> </w:t>
-            </w:r>
-            <w:r>
-              <w:rPr>
-                <w:rFonts w:ascii="Times New Roman" w:eastAsia="Times New Roman" w:hAnsi="Times New Roman" w:cs="Times New Roman"/>
-                <w:kern w:val="0"/>
-                <w:sz w:val="24"/>
-                <w:szCs w:val="24"/>
-                <w:lang w:eastAsia="en-AU"/>
-                <w14:ligatures w14:val="none"/>
-              </w:rPr>
-              <w:t>Google review integration. Community link integration.</w:t>
+              <w:t>Sanity blog.</w:t>
+            </w:r>
+            <w:r>
+              <w:rPr>
+                <w:rFonts w:ascii="Times New Roman" w:eastAsia="Times New Roman" w:hAnsi="Times New Roman" w:cs="Times New Roman"/>
+                <w:kern w:val="0"/>
+                <w:sz w:val="24"/>
+                <w:szCs w:val="24"/>
+                <w:lang w:eastAsia="en-AU"/>
+                <w14:ligatures w14:val="none"/>
+              </w:rPr>
+              <w:t xml:space="preserve"> Google Business Profile management.</w:t>
+            </w:r>
+            <w:r>
+              <w:rPr>
+                <w:rFonts w:ascii="Times New Roman" w:eastAsia="Times New Roman" w:hAnsi="Times New Roman" w:cs="Times New Roman"/>
+                <w:kern w:val="0"/>
+                <w:sz w:val="24"/>
+                <w:szCs w:val="24"/>
+                <w:lang w:eastAsia="en-AU"/>
+                <w14:ligatures w14:val="none"/>
+              </w:rPr>
+              <w:t xml:space="preserve"> Google review integration. Community link integration.</w:t>
             </w:r>
           </w:p>
         </w:tc>
@@ -898,18 +795,7 @@
                 <w:lang w:eastAsia="en-AU"/>
                 <w14:ligatures w14:val="none"/>
               </w:rPr>
-              <w:t xml:space="preserve"> </w:t>
-            </w:r>
-            <w:r>
-              <w:rPr>
-                <w:rFonts w:ascii="Times New Roman" w:eastAsia="Times New Roman" w:hAnsi="Times New Roman" w:cs="Times New Roman"/>
-                <w:kern w:val="0"/>
-                <w:sz w:val="24"/>
-                <w:szCs w:val="24"/>
-                <w:lang w:eastAsia="en-AU"/>
-                <w14:ligatures w14:val="none"/>
-              </w:rPr>
-              <w:t>Sanity blog</w:t>
+              <w:t xml:space="preserve"> Sanity blog</w:t>
             </w:r>
           </w:p>
         </w:tc>
@@ -1062,18 +948,7 @@
                 <w:lang w:eastAsia="en-AU"/>
                 <w14:ligatures w14:val="none"/>
               </w:rPr>
-              <w:t>Heathcote</w:t>
-            </w:r>
-            <w:r>
-              <w:rPr>
-                <w:rFonts w:ascii="Times New Roman" w:eastAsia="Times New Roman" w:hAnsi="Times New Roman" w:cs="Times New Roman"/>
-                <w:kern w:val="0"/>
-                <w:sz w:val="24"/>
-                <w:szCs w:val="24"/>
-                <w:lang w:eastAsia="en-AU"/>
-                <w14:ligatures w14:val="none"/>
-              </w:rPr>
-              <w:t xml:space="preserve"> and surrounds,</w:t>
+              <w:t>Heathcote and surrounds,</w:t>
             </w:r>
             <w:r>
               <w:rPr>
@@ -1340,18 +1215,7 @@
                 <w:lang w:eastAsia="en-AU"/>
                 <w14:ligatures w14:val="none"/>
               </w:rPr>
-              <w:t>Katandra</w:t>
-            </w:r>
-            <w:r>
-              <w:rPr>
-                <w:rFonts w:ascii="Times New Roman" w:eastAsia="Times New Roman" w:hAnsi="Times New Roman" w:cs="Times New Roman"/>
-                <w:kern w:val="0"/>
-                <w:sz w:val="24"/>
-                <w:szCs w:val="24"/>
-                <w:lang w:eastAsia="en-AU"/>
-                <w14:ligatures w14:val="none"/>
-              </w:rPr>
-              <w:t>,</w:t>
+              <w:t>Katandra,</w:t>
             </w:r>
             <w:r>
               <w:rPr>
@@ -1459,31 +1323,7 @@
                 <w:lang w:eastAsia="en-AU"/>
                 <w14:ligatures w14:val="none"/>
               </w:rPr>
-              <w:t xml:space="preserve"> Google Merchant </w:t>
-            </w:r>
-            <w:proofErr w:type="spellStart"/>
-            <w:r>
-              <w:rPr>
-                <w:rFonts w:ascii="Times New Roman" w:eastAsia="Times New Roman" w:hAnsi="Times New Roman" w:cs="Times New Roman"/>
-                <w:kern w:val="0"/>
-                <w:sz w:val="24"/>
-                <w:szCs w:val="24"/>
-                <w:lang w:eastAsia="en-AU"/>
-                <w14:ligatures w14:val="none"/>
-              </w:rPr>
-              <w:t>Center</w:t>
-            </w:r>
-            <w:proofErr w:type="spellEnd"/>
-            <w:r>
-              <w:rPr>
-                <w:rFonts w:ascii="Times New Roman" w:eastAsia="Times New Roman" w:hAnsi="Times New Roman" w:cs="Times New Roman"/>
-                <w:kern w:val="0"/>
-                <w:sz w:val="24"/>
-                <w:szCs w:val="24"/>
-                <w:lang w:eastAsia="en-AU"/>
-                <w14:ligatures w14:val="none"/>
-              </w:rPr>
-              <w:t xml:space="preserve"> product management. </w:t>
+              <w:t xml:space="preserve"> Google Merchant Center product management. </w:t>
             </w:r>
           </w:p>
         </w:tc>
@@ -1614,7 +1454,29 @@
                 <w:lang w:eastAsia="en-AU"/>
                 <w14:ligatures w14:val="none"/>
               </w:rPr>
-              <w:t>Horse Hay specialists</w:t>
+              <w:t>Horse Hay specialists,</w:t>
+            </w:r>
+            <w:r>
+              <w:rPr>
+                <w:rFonts w:ascii="Times New Roman" w:eastAsia="Times New Roman" w:hAnsi="Times New Roman" w:cs="Times New Roman"/>
+                <w:kern w:val="0"/>
+                <w:sz w:val="24"/>
+                <w:szCs w:val="24"/>
+                <w:lang w:eastAsia="en-AU"/>
+                <w14:ligatures w14:val="none"/>
+              </w:rPr>
+              <w:t xml:space="preserve"> </w:t>
+            </w:r>
+            <w:r>
+              <w:rPr>
+                <w:rFonts w:ascii="Times New Roman" w:eastAsia="Times New Roman" w:hAnsi="Times New Roman" w:cs="Times New Roman"/>
+                <w:kern w:val="0"/>
+                <w:sz w:val="24"/>
+                <w:szCs w:val="24"/>
+                <w:lang w:eastAsia="en-AU"/>
+                <w14:ligatures w14:val="none"/>
+              </w:rPr>
+              <w:t>Invergordon</w:t>
             </w:r>
             <w:r>
               <w:rPr>
@@ -1647,7 +1509,52 @@
                 <w:lang w:eastAsia="en-AU"/>
                 <w14:ligatures w14:val="none"/>
               </w:rPr>
-              <w:t>Invergordon</w:t>
+              <w:t>Victoria</w:t>
+            </w:r>
+          </w:p>
+        </w:tc>
+        <w:tc>
+          <w:tcPr>
+            <w:tcW w:w="0" w:type="auto"/>
+            <w:vAlign w:val="center"/>
+            <w:hideMark/>
+          </w:tcPr>
+          <w:p>
+            <w:pPr>
+              <w:spacing w:after="0" w:line="240" w:lineRule="auto"/>
+              <w:rPr>
+                <w:rFonts w:ascii="Times New Roman" w:eastAsia="Times New Roman" w:hAnsi="Times New Roman" w:cs="Times New Roman"/>
+                <w:kern w:val="0"/>
+                <w:sz w:val="24"/>
+                <w:szCs w:val="24"/>
+                <w:lang w:eastAsia="en-AU"/>
+                <w14:ligatures w14:val="none"/>
+              </w:rPr>
+            </w:pPr>
+            <w:r>
+              <w:rPr>
+                <w:rFonts w:ascii="Times New Roman" w:eastAsia="Times New Roman" w:hAnsi="Times New Roman" w:cs="Times New Roman"/>
+                <w:kern w:val="0"/>
+                <w:sz w:val="24"/>
+                <w:szCs w:val="24"/>
+                <w:lang w:eastAsia="en-AU"/>
+                <w14:ligatures w14:val="none"/>
+              </w:rPr>
+              <w:t>Next.js website,</w:t>
+            </w:r>
+            <w:r>
+              <w:rPr>
+                <w:rFonts w:ascii="Times New Roman" w:eastAsia="Times New Roman" w:hAnsi="Times New Roman" w:cs="Times New Roman"/>
+                <w:kern w:val="0"/>
+                <w:sz w:val="24"/>
+                <w:szCs w:val="24"/>
+                <w:lang w:eastAsia="en-AU"/>
+                <w14:ligatures w14:val="none"/>
+              </w:rPr>
+              <w:t xml:space="preserve"> </w:t>
+            </w:r>
+            <w:r>
+              <w:t>Mobile-first responsive design</w:t>
             </w:r>
             <w:r>
               <w:rPr>
@@ -1669,84 +1576,6 @@
                 <w:lang w:eastAsia="en-AU"/>
                 <w14:ligatures w14:val="none"/>
               </w:rPr>
-              <w:t xml:space="preserve"> </w:t>
-            </w:r>
-            <w:r>
-              <w:rPr>
-                <w:rFonts w:ascii="Times New Roman" w:eastAsia="Times New Roman" w:hAnsi="Times New Roman" w:cs="Times New Roman"/>
-                <w:kern w:val="0"/>
-                <w:sz w:val="24"/>
-                <w:szCs w:val="24"/>
-                <w:lang w:eastAsia="en-AU"/>
-                <w14:ligatures w14:val="none"/>
-              </w:rPr>
-              <w:t>Victoria</w:t>
-            </w:r>
-          </w:p>
-        </w:tc>
-        <w:tc>
-          <w:tcPr>
-            <w:tcW w:w="0" w:type="auto"/>
-            <w:vAlign w:val="center"/>
-            <w:hideMark/>
-          </w:tcPr>
-          <w:p>
-            <w:pPr>
-              <w:spacing w:after="0" w:line="240" w:lineRule="auto"/>
-              <w:rPr>
-                <w:rFonts w:ascii="Times New Roman" w:eastAsia="Times New Roman" w:hAnsi="Times New Roman" w:cs="Times New Roman"/>
-                <w:kern w:val="0"/>
-                <w:sz w:val="24"/>
-                <w:szCs w:val="24"/>
-                <w:lang w:eastAsia="en-AU"/>
-                <w14:ligatures w14:val="none"/>
-              </w:rPr>
-            </w:pPr>
-            <w:r>
-              <w:rPr>
-                <w:rFonts w:ascii="Times New Roman" w:eastAsia="Times New Roman" w:hAnsi="Times New Roman" w:cs="Times New Roman"/>
-                <w:kern w:val="0"/>
-                <w:sz w:val="24"/>
-                <w:szCs w:val="24"/>
-                <w:lang w:eastAsia="en-AU"/>
-                <w14:ligatures w14:val="none"/>
-              </w:rPr>
-              <w:t>Next.js website,</w:t>
-            </w:r>
-            <w:r>
-              <w:rPr>
-                <w:rFonts w:ascii="Times New Roman" w:eastAsia="Times New Roman" w:hAnsi="Times New Roman" w:cs="Times New Roman"/>
-                <w:kern w:val="0"/>
-                <w:sz w:val="24"/>
-                <w:szCs w:val="24"/>
-                <w:lang w:eastAsia="en-AU"/>
-                <w14:ligatures w14:val="none"/>
-              </w:rPr>
-              <w:t xml:space="preserve"> </w:t>
-            </w:r>
-            <w:r>
-              <w:t>Mobile-first responsive design</w:t>
-            </w:r>
-            <w:r>
-              <w:rPr>
-                <w:rFonts w:ascii="Times New Roman" w:eastAsia="Times New Roman" w:hAnsi="Times New Roman" w:cs="Times New Roman"/>
-                <w:kern w:val="0"/>
-                <w:sz w:val="24"/>
-                <w:szCs w:val="24"/>
-                <w:lang w:eastAsia="en-AU"/>
-                <w14:ligatures w14:val="none"/>
-              </w:rPr>
-              <w:t>,</w:t>
-            </w:r>
-            <w:r>
-              <w:rPr>
-                <w:rFonts w:ascii="Times New Roman" w:eastAsia="Times New Roman" w:hAnsi="Times New Roman" w:cs="Times New Roman"/>
-                <w:kern w:val="0"/>
-                <w:sz w:val="24"/>
-                <w:szCs w:val="24"/>
-                <w:lang w:eastAsia="en-AU"/>
-                <w14:ligatures w14:val="none"/>
-              </w:rPr>
               <w:t xml:space="preserve"> SEO services, </w:t>
             </w:r>
             <w:r>
@@ -1791,18 +1620,7 @@
                 <w:lang w:eastAsia="en-AU"/>
                 <w14:ligatures w14:val="none"/>
               </w:rPr>
-              <w:t>pree contact form</w:t>
-            </w:r>
-            <w:r>
-              <w:rPr>
-                <w:rFonts w:ascii="Times New Roman" w:eastAsia="Times New Roman" w:hAnsi="Times New Roman" w:cs="Times New Roman"/>
-                <w:kern w:val="0"/>
-                <w:sz w:val="24"/>
-                <w:szCs w:val="24"/>
-                <w:lang w:eastAsia="en-AU"/>
-                <w14:ligatures w14:val="none"/>
-              </w:rPr>
-              <w:t>.</w:t>
+              <w:t>pree contact form.</w:t>
             </w:r>
           </w:p>
         </w:tc>
@@ -1966,18 +1784,7 @@
                 <w:lang w:eastAsia="en-AU"/>
                 <w14:ligatures w14:val="none"/>
               </w:rPr>
-              <w:t>Seymour</w:t>
-            </w:r>
-            <w:r>
-              <w:rPr>
-                <w:rFonts w:ascii="Times New Roman" w:eastAsia="Times New Roman" w:hAnsi="Times New Roman" w:cs="Times New Roman"/>
-                <w:kern w:val="0"/>
-                <w:sz w:val="24"/>
-                <w:szCs w:val="24"/>
-                <w:lang w:eastAsia="en-AU"/>
-                <w14:ligatures w14:val="none"/>
-              </w:rPr>
-              <w:t xml:space="preserve"> and surrounds,</w:t>
+              <w:t>Seymour and surrounds,</w:t>
             </w:r>
             <w:r>
               <w:rPr>
@@ -2058,7 +1865,29 @@
                 <w:lang w:eastAsia="en-AU"/>
                 <w14:ligatures w14:val="none"/>
               </w:rPr>
-              <w:t>implementation</w:t>
+              <w:t xml:space="preserve">implementation </w:t>
+            </w:r>
+            <w:r>
+              <w:rPr>
+                <w:rFonts w:ascii="Times New Roman" w:eastAsia="Times New Roman" w:hAnsi="Times New Roman" w:cs="Times New Roman"/>
+                <w:kern w:val="0"/>
+                <w:sz w:val="24"/>
+                <w:szCs w:val="24"/>
+                <w:lang w:eastAsia="en-AU"/>
+                <w14:ligatures w14:val="none"/>
+              </w:rPr>
+              <w:t xml:space="preserve">service and location </w:t>
+            </w:r>
+            <w:r>
+              <w:rPr>
+                <w:rFonts w:ascii="Times New Roman" w:eastAsia="Times New Roman" w:hAnsi="Times New Roman" w:cs="Times New Roman"/>
+                <w:kern w:val="0"/>
+                <w:sz w:val="24"/>
+                <w:szCs w:val="24"/>
+                <w:lang w:eastAsia="en-AU"/>
+                <w14:ligatures w14:val="none"/>
+              </w:rPr>
+              <w:t>targeting</w:t>
             </w:r>
             <w:r>
               <w:rPr>
@@ -2080,18 +1909,62 @@
                 <w:lang w:eastAsia="en-AU"/>
                 <w14:ligatures w14:val="none"/>
               </w:rPr>
-              <w:t xml:space="preserve">service and location </w:t>
-            </w:r>
-            <w:r>
-              <w:rPr>
-                <w:rFonts w:ascii="Times New Roman" w:eastAsia="Times New Roman" w:hAnsi="Times New Roman" w:cs="Times New Roman"/>
-                <w:kern w:val="0"/>
-                <w:sz w:val="24"/>
-                <w:szCs w:val="24"/>
-                <w:lang w:eastAsia="en-AU"/>
-                <w14:ligatures w14:val="none"/>
-              </w:rPr>
-              <w:t>targeting</w:t>
+              <w:t>with funnels</w:t>
+            </w:r>
+            <w:r>
+              <w:rPr>
+                <w:rFonts w:ascii="Times New Roman" w:eastAsia="Times New Roman" w:hAnsi="Times New Roman" w:cs="Times New Roman"/>
+                <w:kern w:val="0"/>
+                <w:sz w:val="24"/>
+                <w:szCs w:val="24"/>
+                <w:lang w:eastAsia="en-AU"/>
+                <w14:ligatures w14:val="none"/>
+              </w:rPr>
+              <w:t xml:space="preserve">, sanity blog, </w:t>
+            </w:r>
+            <w:r>
+              <w:rPr>
+                <w:rFonts w:ascii="Times New Roman" w:eastAsia="Times New Roman" w:hAnsi="Times New Roman" w:cs="Times New Roman"/>
+                <w:kern w:val="0"/>
+                <w:sz w:val="24"/>
+                <w:szCs w:val="24"/>
+                <w:lang w:eastAsia="en-AU"/>
+                <w14:ligatures w14:val="none"/>
+              </w:rPr>
+              <w:t>F</w:t>
+            </w:r>
+            <w:r>
+              <w:rPr>
+                <w:rFonts w:ascii="Times New Roman" w:eastAsia="Times New Roman" w:hAnsi="Times New Roman" w:cs="Times New Roman"/>
+                <w:kern w:val="0"/>
+                <w:sz w:val="24"/>
+                <w:szCs w:val="24"/>
+                <w:lang w:eastAsia="en-AU"/>
+                <w14:ligatures w14:val="none"/>
+              </w:rPr>
+              <w:t>orm</w:t>
+            </w:r>
+            <w:r>
+              <w:rPr>
+                <w:rFonts w:ascii="Times New Roman" w:eastAsia="Times New Roman" w:hAnsi="Times New Roman" w:cs="Times New Roman"/>
+                <w:kern w:val="0"/>
+                <w:sz w:val="24"/>
+                <w:szCs w:val="24"/>
+                <w:lang w:eastAsia="en-AU"/>
+                <w14:ligatures w14:val="none"/>
+              </w:rPr>
+              <w:t xml:space="preserve"> S</w:t>
+            </w:r>
+            <w:r>
+              <w:rPr>
+                <w:rFonts w:ascii="Times New Roman" w:eastAsia="Times New Roman" w:hAnsi="Times New Roman" w:cs="Times New Roman"/>
+                <w:kern w:val="0"/>
+                <w:sz w:val="24"/>
+                <w:szCs w:val="24"/>
+                <w:lang w:eastAsia="en-AU"/>
+                <w14:ligatures w14:val="none"/>
+              </w:rPr>
+              <w:t>pree contact form.</w:t>
             </w:r>
             <w:r>
               <w:rPr>
@@ -2113,83 +1986,6 @@
                 <w:lang w:eastAsia="en-AU"/>
                 <w14:ligatures w14:val="none"/>
               </w:rPr>
-              <w:t>with funnels</w:t>
-            </w:r>
-            <w:r>
-              <w:rPr>
-                <w:rFonts w:ascii="Times New Roman" w:eastAsia="Times New Roman" w:hAnsi="Times New Roman" w:cs="Times New Roman"/>
-                <w:kern w:val="0"/>
-                <w:sz w:val="24"/>
-                <w:szCs w:val="24"/>
-                <w:lang w:eastAsia="en-AU"/>
-                <w14:ligatures w14:val="none"/>
-              </w:rPr>
-              <w:t xml:space="preserve">, sanity blog, </w:t>
-            </w:r>
-            <w:r>
-              <w:rPr>
-                <w:rFonts w:ascii="Times New Roman" w:eastAsia="Times New Roman" w:hAnsi="Times New Roman" w:cs="Times New Roman"/>
-                <w:kern w:val="0"/>
-                <w:sz w:val="24"/>
-                <w:szCs w:val="24"/>
-                <w:lang w:eastAsia="en-AU"/>
-                <w14:ligatures w14:val="none"/>
-              </w:rPr>
-              <w:t>F</w:t>
-            </w:r>
-            <w:r>
-              <w:rPr>
-                <w:rFonts w:ascii="Times New Roman" w:eastAsia="Times New Roman" w:hAnsi="Times New Roman" w:cs="Times New Roman"/>
-                <w:kern w:val="0"/>
-                <w:sz w:val="24"/>
-                <w:szCs w:val="24"/>
-                <w:lang w:eastAsia="en-AU"/>
-                <w14:ligatures w14:val="none"/>
-              </w:rPr>
-              <w:t>orm</w:t>
-            </w:r>
-            <w:r>
-              <w:rPr>
-                <w:rFonts w:ascii="Times New Roman" w:eastAsia="Times New Roman" w:hAnsi="Times New Roman" w:cs="Times New Roman"/>
-                <w:kern w:val="0"/>
-                <w:sz w:val="24"/>
-                <w:szCs w:val="24"/>
-                <w:lang w:eastAsia="en-AU"/>
-                <w14:ligatures w14:val="none"/>
-              </w:rPr>
-              <w:t xml:space="preserve"> S</w:t>
-            </w:r>
-            <w:r>
-              <w:rPr>
-                <w:rFonts w:ascii="Times New Roman" w:eastAsia="Times New Roman" w:hAnsi="Times New Roman" w:cs="Times New Roman"/>
-                <w:kern w:val="0"/>
-                <w:sz w:val="24"/>
-                <w:szCs w:val="24"/>
-                <w:lang w:eastAsia="en-AU"/>
-                <w14:ligatures w14:val="none"/>
-              </w:rPr>
-              <w:t>pree contact form.</w:t>
-            </w:r>
-            <w:r>
-              <w:rPr>
-                <w:rFonts w:ascii="Times New Roman" w:eastAsia="Times New Roman" w:hAnsi="Times New Roman" w:cs="Times New Roman"/>
-                <w:kern w:val="0"/>
-                <w:sz w:val="24"/>
-                <w:szCs w:val="24"/>
-                <w:lang w:eastAsia="en-AU"/>
-                <w14:ligatures w14:val="none"/>
-              </w:rPr>
-              <w:t xml:space="preserve"> </w:t>
-            </w:r>
-            <w:r>
-              <w:rPr>
-                <w:rFonts w:ascii="Times New Roman" w:eastAsia="Times New Roman" w:hAnsi="Times New Roman" w:cs="Times New Roman"/>
-                <w:kern w:val="0"/>
-                <w:sz w:val="24"/>
-                <w:szCs w:val="24"/>
-                <w:lang w:eastAsia="en-AU"/>
-                <w14:ligatures w14:val="none"/>
-              </w:rPr>
               <w:t>Sanity blog</w:t>
             </w:r>
             <w:r>
@@ -2201,95 +1997,18 @@
                 <w:lang w:eastAsia="en-AU"/>
                 <w14:ligatures w14:val="none"/>
               </w:rPr>
-              <w:t xml:space="preserve">. </w:t>
-            </w:r>
-            <w:r>
-              <w:rPr>
-                <w:rFonts w:ascii="Times New Roman" w:eastAsia="Times New Roman" w:hAnsi="Times New Roman" w:cs="Times New Roman"/>
-                <w:kern w:val="0"/>
-                <w:sz w:val="24"/>
-                <w:szCs w:val="24"/>
-                <w:lang w:eastAsia="en-AU"/>
-                <w14:ligatures w14:val="none"/>
-              </w:rPr>
-              <w:t xml:space="preserve">Google </w:t>
-            </w:r>
-            <w:r>
-              <w:rPr>
-                <w:rFonts w:ascii="Times New Roman" w:eastAsia="Times New Roman" w:hAnsi="Times New Roman" w:cs="Times New Roman"/>
-                <w:kern w:val="0"/>
-                <w:sz w:val="24"/>
-                <w:szCs w:val="24"/>
-                <w:lang w:eastAsia="en-AU"/>
-                <w14:ligatures w14:val="none"/>
-              </w:rPr>
-              <w:t>B</w:t>
-            </w:r>
-            <w:r>
-              <w:rPr>
-                <w:rFonts w:ascii="Times New Roman" w:eastAsia="Times New Roman" w:hAnsi="Times New Roman" w:cs="Times New Roman"/>
-                <w:kern w:val="0"/>
-                <w:sz w:val="24"/>
-                <w:szCs w:val="24"/>
-                <w:lang w:eastAsia="en-AU"/>
-                <w14:ligatures w14:val="none"/>
-              </w:rPr>
-              <w:t xml:space="preserve">usiness </w:t>
-            </w:r>
-            <w:r>
-              <w:rPr>
-                <w:rFonts w:ascii="Times New Roman" w:eastAsia="Times New Roman" w:hAnsi="Times New Roman" w:cs="Times New Roman"/>
-                <w:kern w:val="0"/>
-                <w:sz w:val="24"/>
-                <w:szCs w:val="24"/>
-                <w:lang w:eastAsia="en-AU"/>
-                <w14:ligatures w14:val="none"/>
-              </w:rPr>
-              <w:t>P</w:t>
-            </w:r>
-            <w:r>
-              <w:rPr>
-                <w:rFonts w:ascii="Times New Roman" w:eastAsia="Times New Roman" w:hAnsi="Times New Roman" w:cs="Times New Roman"/>
-                <w:kern w:val="0"/>
-                <w:sz w:val="24"/>
-                <w:szCs w:val="24"/>
-                <w:lang w:eastAsia="en-AU"/>
-                <w14:ligatures w14:val="none"/>
-              </w:rPr>
-              <w:t>rofile management.</w:t>
-            </w:r>
-            <w:r>
-              <w:rPr>
-                <w:rFonts w:ascii="Times New Roman" w:eastAsia="Times New Roman" w:hAnsi="Times New Roman" w:cs="Times New Roman"/>
-                <w:kern w:val="0"/>
-                <w:sz w:val="24"/>
-                <w:szCs w:val="24"/>
-                <w:lang w:eastAsia="en-AU"/>
-                <w14:ligatures w14:val="none"/>
-              </w:rPr>
-              <w:t xml:space="preserve"> </w:t>
-            </w:r>
-            <w:r>
-              <w:rPr>
-                <w:rFonts w:ascii="Times New Roman" w:eastAsia="Times New Roman" w:hAnsi="Times New Roman" w:cs="Times New Roman"/>
-                <w:kern w:val="0"/>
-                <w:sz w:val="24"/>
-                <w:szCs w:val="24"/>
-                <w:lang w:eastAsia="en-AU"/>
-                <w14:ligatures w14:val="none"/>
-              </w:rPr>
-              <w:t>Google review integration.</w:t>
-            </w:r>
-            <w:r>
-              <w:rPr>
-                <w:rFonts w:ascii="Times New Roman" w:eastAsia="Times New Roman" w:hAnsi="Times New Roman" w:cs="Times New Roman"/>
-                <w:kern w:val="0"/>
-                <w:sz w:val="24"/>
-                <w:szCs w:val="24"/>
-                <w:lang w:eastAsia="en-AU"/>
-                <w14:ligatures w14:val="none"/>
-              </w:rPr>
-              <w:t xml:space="preserve"> Community link integration.</w:t>
+              <w:t>. Google Business Profile management.</w:t>
+            </w:r>
+            <w:r>
+              <w:rPr>
+                <w:rFonts w:ascii="Times New Roman" w:eastAsia="Times New Roman" w:hAnsi="Times New Roman" w:cs="Times New Roman"/>
+                <w:kern w:val="0"/>
+                <w:sz w:val="24"/>
+                <w:szCs w:val="24"/>
+                <w:lang w:eastAsia="en-AU"/>
+                <w14:ligatures w14:val="none"/>
+              </w:rPr>
+              <w:t xml:space="preserve"> Google review integration. Community link integration.</w:t>
             </w:r>
           </w:p>
         </w:tc>
@@ -2592,45 +2311,17 @@
                 <w14:ligatures w14:val="none"/>
               </w:rPr>
             </w:pPr>
-            <w:proofErr w:type="spellStart"/>
-            <w:proofErr w:type="gramStart"/>
-            <w:r>
-              <w:rPr>
-                <w:rFonts w:ascii="Times New Roman" w:eastAsia="Times New Roman" w:hAnsi="Times New Roman" w:cs="Times New Roman"/>
-                <w:kern w:val="0"/>
-                <w:sz w:val="24"/>
-                <w:szCs w:val="24"/>
-                <w:lang w:eastAsia="en-AU"/>
-                <w14:ligatures w14:val="none"/>
-              </w:rPr>
-              <w:t>Lets</w:t>
-            </w:r>
-            <w:proofErr w:type="spellEnd"/>
-            <w:proofErr w:type="gramEnd"/>
-            <w:r>
-              <w:rPr>
-                <w:rFonts w:ascii="Times New Roman" w:eastAsia="Times New Roman" w:hAnsi="Times New Roman" w:cs="Times New Roman"/>
-                <w:kern w:val="0"/>
-                <w:sz w:val="24"/>
-                <w:szCs w:val="24"/>
-                <w:lang w:eastAsia="en-AU"/>
-                <w14:ligatures w14:val="none"/>
-              </w:rPr>
-              <w:t xml:space="preserve"> Get </w:t>
-            </w:r>
-            <w:proofErr w:type="spellStart"/>
-            <w:r>
-              <w:rPr>
-                <w:rFonts w:ascii="Times New Roman" w:eastAsia="Times New Roman" w:hAnsi="Times New Roman" w:cs="Times New Roman"/>
-                <w:kern w:val="0"/>
-                <w:sz w:val="24"/>
-                <w:szCs w:val="24"/>
-                <w:lang w:eastAsia="en-AU"/>
-                <w14:ligatures w14:val="none"/>
-              </w:rPr>
-              <w:t>Trowled</w:t>
-            </w:r>
-            <w:proofErr w:type="spellEnd"/>
+            <w:r>
+              <w:rPr>
+                <w:rFonts w:ascii="Times New Roman" w:eastAsia="Times New Roman" w:hAnsi="Times New Roman" w:cs="Times New Roman"/>
+                <w:kern w:val="0"/>
+                <w:sz w:val="24"/>
+                <w:szCs w:val="24"/>
+                <w:lang w:eastAsia="en-AU"/>
+                <w14:ligatures w14:val="none"/>
+              </w:rPr>
+              <w:t>Lets Get Trowled</w:t>
+            </w:r>
           </w:p>
         </w:tc>
         <w:tc>
@@ -2731,18 +2422,7 @@
                 <w:lang w:eastAsia="en-AU"/>
                 <w14:ligatures w14:val="none"/>
               </w:rPr>
-              <w:t xml:space="preserve"> contact form.</w:t>
-            </w:r>
-            <w:r>
-              <w:rPr>
-                <w:rFonts w:ascii="Times New Roman" w:eastAsia="Times New Roman" w:hAnsi="Times New Roman" w:cs="Times New Roman"/>
-                <w:kern w:val="0"/>
-                <w:sz w:val="24"/>
-                <w:szCs w:val="24"/>
-                <w:lang w:eastAsia="en-AU"/>
-                <w14:ligatures w14:val="none"/>
-              </w:rPr>
-              <w:t xml:space="preserve"> Sanity blog</w:t>
+              <w:t xml:space="preserve"> contact form. Sanity blog</w:t>
             </w:r>
             <w:r>
               <w:rPr>
@@ -2910,71 +2590,38 @@
                 <w:lang w:eastAsia="en-AU"/>
                 <w14:ligatures w14:val="none"/>
               </w:rPr>
-              <w:t xml:space="preserve"> Full SEO implementation service targeting</w:t>
-            </w:r>
-            <w:r>
-              <w:rPr>
-                <w:rFonts w:ascii="Times New Roman" w:eastAsia="Times New Roman" w:hAnsi="Times New Roman" w:cs="Times New Roman"/>
-                <w:kern w:val="0"/>
-                <w:sz w:val="24"/>
-                <w:szCs w:val="24"/>
-                <w:lang w:eastAsia="en-AU"/>
-                <w14:ligatures w14:val="none"/>
-              </w:rPr>
-              <w:t xml:space="preserve"> </w:t>
-            </w:r>
-            <w:r>
-              <w:rPr>
-                <w:rFonts w:ascii="Times New Roman" w:eastAsia="Times New Roman" w:hAnsi="Times New Roman" w:cs="Times New Roman"/>
-                <w:kern w:val="0"/>
-                <w:sz w:val="24"/>
-                <w:szCs w:val="24"/>
-                <w:lang w:eastAsia="en-AU"/>
-                <w14:ligatures w14:val="none"/>
-              </w:rPr>
-              <w:t>with funnels, sanity blog, Form</w:t>
-            </w:r>
-            <w:r>
-              <w:rPr>
-                <w:rFonts w:ascii="Times New Roman" w:eastAsia="Times New Roman" w:hAnsi="Times New Roman" w:cs="Times New Roman"/>
-                <w:kern w:val="0"/>
-                <w:sz w:val="24"/>
-                <w:szCs w:val="24"/>
-                <w:lang w:eastAsia="en-AU"/>
-                <w14:ligatures w14:val="none"/>
-              </w:rPr>
-              <w:t xml:space="preserve"> S</w:t>
-            </w:r>
-            <w:r>
-              <w:rPr>
-                <w:rFonts w:ascii="Times New Roman" w:eastAsia="Times New Roman" w:hAnsi="Times New Roman" w:cs="Times New Roman"/>
-                <w:kern w:val="0"/>
-                <w:sz w:val="24"/>
-                <w:szCs w:val="24"/>
-                <w:lang w:eastAsia="en-AU"/>
-                <w14:ligatures w14:val="none"/>
-              </w:rPr>
-              <w:t>pree contact form. Sanity blog</w:t>
-            </w:r>
-          </w:p>
-        </w:tc>
-        <w:tc>
-          <w:tcPr>
-            <w:tcW w:w="0" w:type="auto"/>
-            <w:vAlign w:val="center"/>
-          </w:tcPr>
-          <w:p>
-            <w:pPr>
-              <w:spacing w:after="0" w:line="240" w:lineRule="auto"/>
-              <w:rPr>
-                <w:rFonts w:ascii="Times New Roman" w:eastAsia="Times New Roman" w:hAnsi="Times New Roman" w:cs="Times New Roman"/>
-                <w:kern w:val="0"/>
-                <w:sz w:val="24"/>
-                <w:szCs w:val="24"/>
-                <w:lang w:eastAsia="en-AU"/>
-                <w14:ligatures w14:val="none"/>
-              </w:rPr>
-            </w:pPr>
+              <w:t xml:space="preserve"> Full SEO implementation service targeting with funnels, sanity blog, Form Spree contact form. Sanity blog</w:t>
+            </w:r>
+          </w:p>
+        </w:tc>
+        <w:tc>
+          <w:tcPr>
+            <w:tcW w:w="0" w:type="auto"/>
+            <w:vAlign w:val="center"/>
+          </w:tcPr>
+          <w:p>
+            <w:pPr>
+              <w:spacing w:after="0" w:line="240" w:lineRule="auto"/>
+              <w:rPr>
+                <w:rFonts w:ascii="Times New Roman" w:eastAsia="Times New Roman" w:hAnsi="Times New Roman" w:cs="Times New Roman"/>
+                <w:kern w:val="0"/>
+                <w:sz w:val="24"/>
+                <w:szCs w:val="24"/>
+                <w:lang w:eastAsia="en-AU"/>
+                <w14:ligatures w14:val="none"/>
+              </w:rPr>
+            </w:pPr>
+            <w:r>
+              <w:rPr>
+                <w:rFonts w:ascii="Times New Roman" w:eastAsia="Times New Roman" w:hAnsi="Times New Roman" w:cs="Times New Roman"/>
+                <w:kern w:val="0"/>
+                <w:sz w:val="24"/>
+                <w:szCs w:val="24"/>
+                <w:lang w:eastAsia="en-AU"/>
+                <w14:ligatures w14:val="none"/>
+              </w:rPr>
+              <w:t>lkfcontracting.com.au</w:t>
+            </w:r>
           </w:p>
         </w:tc>
       </w:tr>

</xml_diff>